<commit_message>
final review of m3 scope
</commit_message>
<xml_diff>
--- a/m3/scope.docx
+++ b/m3/scope.docx
@@ -2,7 +2,7 @@
 <file path=word/document.xml><?xml version="1.0" encoding="utf-8"?>
 <w:document xmlns:w="http://schemas.openxmlformats.org/wordprocessingml/2006/main" xmlns:m="http://schemas.openxmlformats.org/officeDocument/2006/math" xmlns:r="http://schemas.openxmlformats.org/officeDocument/2006/relationships" xmlns:o="urn:schemas-microsoft-com:office:office" xmlns:v="urn:schemas-microsoft-com:vml" xmlns:w10="urn:schemas-microsoft-com:office:word" xmlns:a="http://schemas.openxmlformats.org/drawingml/2006/main" xmlns:pic="http://schemas.openxmlformats.org/drawingml/2006/picture" xmlns:wp="http://schemas.openxmlformats.org/drawingml/2006/wordprocessingDrawing">
   <w:body>
-    <w:bookmarkStart w:id="25" w:name="X35d70c291457e480018360d8c28b8d998eaffe2"/>
+    <w:bookmarkStart w:id="23" w:name="X35d70c291457e480018360d8c28b8d998eaffe2"/>
     <w:p>
       <w:pPr>
         <w:spacing w:line="480" w:lineRule="auto" w:before="0" w:after="0"/>
@@ -135,10 +135,10 @@
           <w:rFonts w:ascii="Times New Roman" w:hAnsi="Times New Roman"/>
           <w:sz w:val="24"/>
         </w:rPr>
-        <w:t xml:space="preserve">Schumann Hudson Acquisition &amp; Technology (SHAT) has been hired by a 3D printing company to manage the development and deployment of a customer-facing webpage showcasing its 3D printers, filaments, and spools. The project needs clearly defined boundaries because requests for online ordering, customer accounts, and product reviews could significantly expand the scope. We must establish what the client will receive while allowing flexibility during development.</w:t>
-      </w:r>
-    </w:p>
-    <w:bookmarkStart w:id="20" w:name="scope-management-process"/>
+        <w:t xml:space="preserve">Schumann Hudson Acquisition &amp; Technology (SHAT) has been hired to develop and deploy a customer-facing webpage showcasing a 3D printing company’s printers, filaments, and spools. The project needs clear boundaries because requests for online ordering, customer accounts, or product reviews could expand the scope. We must define what the client will receive and how changes will be evaluated.</w:t>
+      </w:r>
+    </w:p>
+    <w:bookmarkStart w:id="18" w:name="scope-management-process"/>
     <w:p>
       <w:pPr>
         <w:pStyle w:val="Heading2"/>
@@ -165,7 +165,7 @@
           <w:rFonts w:ascii="Times New Roman" w:hAnsi="Times New Roman"/>
           <w:sz w:val="24"/>
         </w:rPr>
-        <w:t xml:space="preserve">We will begin by working with the client to define requirements for product descriptions, images, specifications, navigation, search, and responsive design. The team will document assumptions, constraints, exclusions, and acceptance criteria in a scope statement. A work breakdown structure (WBS) will divide the work into manageable deliverables, including design, product content, development, security testing, and deployment. These practices support the project management principles of tailoring the approach to the project and focusing on its intended outcomes (Project Management Institute [PMI], 2021).</w:t>
+        <w:t xml:space="preserve">The team will begin by working with the client to define requirements for product descriptions, images, specifications, navigation, search, and responsive design. The team will document assumptions, constraints, exclusions, and acceptance criteria in a scope statement. A work breakdown structure (WBS) will divide the work into manageable deliverables, including design, product content, development, security testing, and deployment. These practices support the project management principles of tailoring the approach to the project and focusing on its intended outcomes (Project Management Institute [PMI], 2021).</w:t>
       </w:r>
     </w:p>
     <w:p>
@@ -196,8 +196,8 @@
         <w:t xml:space="preserve">The experience with the Darfcloud modernization project demonstrated why identifying dependencies matters. We recently completed a sprint that backported authentication to the legacy Frosmear application. The task appeared relatively straightforward, but it highlighted dependencies involving existing accounts, permissions, and the complexities of user migration. Those lessons reinforced the value of evaluating how a change affects surrounding systems before planning the next increment. We would apply the same approach by identifying dependencies early and revisiting the plan as new information emerges.</w:t>
       </w:r>
     </w:p>
-    <w:bookmarkEnd w:id="20"/>
-    <w:bookmarkStart w:id="21" w:name="X24c9f40d5da2d2944ef50de86c7116a7f7abd3d"/>
+    <w:bookmarkEnd w:id="18"/>
+    <w:bookmarkStart w:id="19" w:name="X24c9f40d5da2d2944ef50de86c7116a7f7abd3d"/>
     <w:p>
       <w:pPr>
         <w:pStyle w:val="Heading2"/>
@@ -224,7 +224,7 @@
           <w:rFonts w:ascii="Times New Roman" w:hAnsi="Times New Roman"/>
           <w:sz w:val="24"/>
         </w:rPr>
-        <w:t xml:space="preserve">An iterative, agile approach would allow us to deliver working portions of the website and gather client feedback throughout development. Initial planning would establish the requirements and product backlog. The first sprint could deliver the basic site structure and navigation, while later sprints could add product pages, responsive layouts, search functionality, and content. Sprint reviews would allow stakeholders to identify problems before they become expensive to correct.</w:t>
+        <w:t xml:space="preserve">An iterative, agile approach would allow the team to deliver working features and gather feedback throughout development. Planning would establish requirements, priorities, and a product backlog. The first sprint could deliver the basic layout and navigation; later sprints could add product pages, responsive design, and search. Sprint reviews would give stakeholders opportunities to identify problems before they become expensive to fix.</w:t>
       </w:r>
     </w:p>
     <w:p>
@@ -238,11 +238,11 @@
           <w:rFonts w:ascii="Times New Roman" w:hAnsi="Times New Roman"/>
           <w:sz w:val="24"/>
         </w:rPr>
-        <w:t xml:space="preserve">A project management platform would track requirements and tasks, while Git would manage source code. Automated tests and a staging environment would help verify changes before production deployment. Each feature would have measurable acceptance criteria, and the team would review the remaining scope, dependencies, and priorities at the end of each sprint.</w:t>
-      </w:r>
-    </w:p>
-    <w:bookmarkEnd w:id="21"/>
-    <w:bookmarkStart w:id="22" w:name="security-and-deployment-considerations"/>
+        <w:t xml:space="preserve">A project management platform would track tasks and requirements, while Git would manage source code. Automated tests and a staging environment would help verify changes before production deployment. Each feature would have measurable acceptance criteria, and the team would review priorities, dependencies, and remaining scope at the end of each sprint.</w:t>
+      </w:r>
+    </w:p>
+    <w:bookmarkEnd w:id="19"/>
+    <w:bookmarkStart w:id="20" w:name="security-and-deployment-considerations"/>
     <w:p>
       <w:pPr>
         <w:pStyle w:val="Heading2"/>
@@ -269,7 +269,7 @@
           <w:rFonts w:ascii="Times New Roman" w:hAnsi="Times New Roman"/>
           <w:sz w:val="24"/>
         </w:rPr>
-        <w:t xml:space="preserve">Security must be part of the scope from the beginning. We will recommend HTTPS, least-privilege access, secure administrative authentication, and protection against common web vulnerabilities. The team will review and document firewall rules, network configurations, certificates, and patching procedures for the client’s infrastructure. Documented network design and configuration practices can help reduce avoidable infrastructure problems (Cisco, 2024).</w:t>
+        <w:t xml:space="preserve">Security requirements must be included in the scope from the beginning. The team should implement HTTPS, least-privilege access, secure administrative authentication, and protections against common web vulnerabilities. It should review firewall rules, network configuration, certificates, and patching procedures. Documented network design and configuration practices help reduce infrastructure risks (Cisco, 2024).</w:t>
       </w:r>
     </w:p>
     <w:p>
@@ -283,11 +283,11 @@
           <w:rFonts w:ascii="Times New Roman" w:hAnsi="Times New Roman"/>
           <w:sz w:val="24"/>
         </w:rPr>
-        <w:t xml:space="preserve">The deployment plan will include development, testing, staging, and production environments. The team will test functionality, browser compatibility, performance, and security before release. Backups, monitoring, documented configurations, and a rollback procedure should be in place before production changes begin. Secure development practices should be integrated throughout the lifecycle rather than postponed until release (Souppaya et al., 2022).</w:t>
-      </w:r>
-    </w:p>
-    <w:bookmarkEnd w:id="22"/>
-    <w:bookmarkStart w:id="23" w:name="conclusion"/>
+        <w:t xml:space="preserve">Deployment should use separate development, testing, staging, and production environments. Before release, the team will test functionality, browser compatibility, performance, and security. Backups, monitoring, documented configurations, and a rollback procedure should be ready before deployment. Secure development practices should be integrated throughout the lifecycle rather than postponed until release (Souppaya et al., 2022).</w:t>
+      </w:r>
+    </w:p>
+    <w:bookmarkEnd w:id="20"/>
+    <w:bookmarkStart w:id="21" w:name="conclusion"/>
     <w:p>
       <w:pPr>
         <w:pStyle w:val="Heading2"/>
@@ -314,11 +314,11 @@
           <w:rFonts w:ascii="Times New Roman" w:hAnsi="Times New Roman"/>
           <w:sz w:val="24"/>
         </w:rPr>
-        <w:t xml:space="preserve">Effective scope management will help us deliver the webpage without allowing uncontrolled feature requests to expand the project. Agile development provides flexibility through short iterations and stakeholder feedback, while a scope baseline, acceptance criteria, and change management maintain accountability. Lessons from the Frosmear authentication sprint reinforce that even small features can expose dependencies affecting later work. Applying that lesson will help us deliver a secure, functional website within the agreed scope.</w:t>
-      </w:r>
-    </w:p>
-    <w:bookmarkEnd w:id="23"/>
-    <w:bookmarkStart w:id="24" w:name="references"/>
+        <w:t xml:space="preserve">Effective scope management will deliver a secure, functional webpage without uncontrolled feature growth. Agile iterations allow flexibility, while the scope baseline, acceptance criteria, and change control keep the project accountable. The Darfcloud authentication sprint demonstrated that even small changes can affect surrounding systems. Applying that lesson will help the team manage dependencies and deliver the agreed product.</w:t>
+      </w:r>
+    </w:p>
+    <w:bookmarkEnd w:id="21"/>
+    <w:bookmarkStart w:id="22" w:name="references"/>
     <w:p>
       <w:pPr>
         <w:pStyle w:val="Heading2"/>
@@ -358,19 +358,63 @@
       </w:r>
       <w:r>
         <w:rPr>
+          <w:rFonts w:ascii="Times New Roman" w:hAnsi="Times New Roman"/>
+          <w:i/>
           <w:iCs/>
+          <w:sz w:val="24"/>
+        </w:rPr>
+        <w:t xml:space="preserve">Cisco cloud campus LAN design guide</w:t>
+      </w:r>
+      <w:r>
+        <w:rPr>
+          <w:rFonts w:ascii="Times New Roman" w:hAnsi="Times New Roman"/>
+          <w:sz w:val="24"/>
+        </w:rPr>
+        <w:t xml:space="preserve">. https://www.cisco.com/c/en/us/solutions/collateral/enterprise/design-zone-campus/cloud-campus-lan-design-guide.html</w:t>
+      </w:r>
+    </w:p>
+    <w:p>
+      <w:pPr>
+        <w:pStyle w:val="BodyText"/>
+        <w:spacing w:line="480" w:lineRule="auto" w:before="0" w:after="0"/>
+        <w:ind w:left="720" w:hanging="720"/>
+      </w:pPr>
+      <w:r>
+        <w:rPr>
+          <w:rFonts w:ascii="Times New Roman" w:hAnsi="Times New Roman"/>
+          <w:sz w:val="24"/>
+        </w:rPr>
+        <w:t xml:space="preserve">Project Management Institute. (2021).</w:t>
+      </w:r>
+      <w:r>
+        <w:rPr>
+          <w:rFonts w:ascii="Times New Roman" w:hAnsi="Times New Roman"/>
+          <w:sz w:val="24"/>
+        </w:rPr>
+        <w:t xml:space="preserve"> </w:t>
+      </w:r>
+      <w:r>
+        <w:rPr>
           <w:rFonts w:ascii="Times New Roman" w:hAnsi="Times New Roman"/>
           <w:i/>
-          <w:sz w:val="24"/>
-        </w:rPr>
-        <w:t xml:space="preserve">Cisco cloud campus LAN design guide</w:t>
-      </w:r>
-      <w:r>
-        <w:rPr>
-          <w:rFonts w:ascii="Times New Roman" w:hAnsi="Times New Roman"/>
-          <w:sz w:val="24"/>
-        </w:rPr>
-        <w:t xml:space="preserve">. https://www.cisco.com/c/en/us/solutions/collateral/enterprise/design-zone-campus/cloud-campus-lan-design-guide.html</w:t>
+          <w:iCs/>
+          <w:sz w:val="24"/>
+        </w:rPr>
+        <w:t xml:space="preserve">A guide to the project management body of knowledge (PMBOK® guide)</w:t>
+      </w:r>
+      <w:r>
+        <w:rPr>
+          <w:rFonts w:ascii="Times New Roman" w:hAnsi="Times New Roman"/>
+          <w:sz w:val="24"/>
+        </w:rPr>
+        <w:t xml:space="preserve"> </w:t>
+      </w:r>
+      <w:r>
+        <w:rPr>
+          <w:rFonts w:ascii="Times New Roman" w:hAnsi="Times New Roman"/>
+          <w:sz w:val="24"/>
+        </w:rPr>
+        <w:t xml:space="preserve">(7th ed.).</w:t>
       </w:r>
     </w:p>
     <w:p>
@@ -384,7 +428,7 @@
           <w:rFonts w:ascii="Times New Roman" w:hAnsi="Times New Roman"/>
           <w:sz w:val="24"/>
         </w:rPr>
-        <w:t xml:space="preserve">Project Management Institute. (2021).</w:t>
+        <w:t xml:space="preserve">Souppaya, M., Scarfone, K., &amp; Dodson, D. (2022).</w:t>
       </w:r>
       <w:r>
         <w:rPr>
@@ -395,12 +439,12 @@
       </w:r>
       <w:r>
         <w:rPr>
+          <w:rFonts w:ascii="Times New Roman" w:hAnsi="Times New Roman"/>
+          <w:i/>
           <w:iCs/>
-          <w:rFonts w:ascii="Times New Roman" w:hAnsi="Times New Roman"/>
-          <w:i/>
-          <w:sz w:val="24"/>
-        </w:rPr>
-        <w:t xml:space="preserve">A guide to the project management body of knowledge (PMBOK® guide)</w:t>
+          <w:sz w:val="24"/>
+        </w:rPr>
+        <w:t xml:space="preserve">Secure software development framework (SSDF) version 1.1: Recommendations for mitigating the risk of software vulnerabilities</w:t>
       </w:r>
       <w:r>
         <w:rPr>
@@ -414,55 +458,11 @@
           <w:rFonts w:ascii="Times New Roman" w:hAnsi="Times New Roman"/>
           <w:sz w:val="24"/>
         </w:rPr>
-        <w:t xml:space="preserve">(7th ed.).</w:t>
-      </w:r>
-    </w:p>
-    <w:p>
-      <w:pPr>
-        <w:pStyle w:val="BodyText"/>
-        <w:spacing w:line="480" w:lineRule="auto" w:before="0" w:after="0"/>
-        <w:ind w:left="720" w:hanging="720"/>
-      </w:pPr>
-      <w:r>
-        <w:rPr>
-          <w:rFonts w:ascii="Times New Roman" w:hAnsi="Times New Roman"/>
-          <w:sz w:val="24"/>
-        </w:rPr>
-        <w:t xml:space="preserve">Souppaya, M., Scarfone, K., &amp; Dodson, D. (2022).</w:t>
-      </w:r>
-      <w:r>
-        <w:rPr>
-          <w:rFonts w:ascii="Times New Roman" w:hAnsi="Times New Roman"/>
-          <w:sz w:val="24"/>
-        </w:rPr>
-        <w:t xml:space="preserve"> </w:t>
-      </w:r>
-      <w:r>
-        <w:rPr>
-          <w:iCs/>
-          <w:rFonts w:ascii="Times New Roman" w:hAnsi="Times New Roman"/>
-          <w:i/>
-          <w:sz w:val="24"/>
-        </w:rPr>
-        <w:t xml:space="preserve">Secure software development framework (SSDF) version 1.1: Recommendations for mitigating the risk of software vulnerabilities (NIST SP 800-218).</w:t>
-      </w:r>
-      <w:r>
-        <w:rPr>
-          <w:rFonts w:ascii="Times New Roman" w:hAnsi="Times New Roman"/>
-          <w:sz w:val="24"/>
-        </w:rPr>
-        <w:t xml:space="preserve"> </w:t>
-      </w:r>
-      <w:r>
-        <w:rPr>
-          <w:rFonts w:ascii="Times New Roman" w:hAnsi="Times New Roman"/>
-          <w:sz w:val="24"/>
-        </w:rPr>
-        <w:t xml:space="preserve">National Institute of Standards and Technology. https://doi.org/10.6028/NIST.SP.800-218</w:t>
-      </w:r>
-    </w:p>
-    <w:bookmarkEnd w:id="24"/>
-    <w:bookmarkEnd w:id="25"/>
+        <w:t xml:space="preserve">(NIST SP 800-218). National Institute of Standards and Technology. https://doi.org/10.6028/NIST.SP.800-218</w:t>
+      </w:r>
+    </w:p>
+    <w:bookmarkEnd w:id="22"/>
+    <w:bookmarkEnd w:id="23"/>
     <w:sectPr>
       <w:headerReference r:id="rId9" w:type="default"/>
       <w:footnotePr>
@@ -523,14 +523,14 @@
 <file path=word/numbering.xml><?xml version="1.0" encoding="utf-8"?>
 <w:numbering xmlns:w="http://schemas.openxmlformats.org/wordprocessingml/2006/main">
   <w:abstractNum w:abstractNumId="990">
-    <w:nsid w:val="A990"/>
+    <w:nsid w:val="0000A990"/>
     <w:multiLevelType w:val="multilevel"/>
     <w:lvl w:ilvl="0">
       <w:numFmt w:val="bullet"/>
       <w:lvlText w:val=" "/>
       <w:lvlJc w:val="left"/>
       <w:pPr>
-        <w:ind w:left="720" w:hanging="480"/>
+        <w:ind w:left="720" w:hanging="360"/>
       </w:pPr>
     </w:lvl>
     <w:lvl w:ilvl="1">
@@ -538,7 +538,7 @@
       <w:lvlText w:val=" "/>
       <w:lvlJc w:val="left"/>
       <w:pPr>
-        <w:ind w:left="1440" w:hanging="480"/>
+        <w:ind w:left="1440" w:hanging="360"/>
       </w:pPr>
     </w:lvl>
     <w:lvl w:ilvl="2">
@@ -546,7 +546,7 @@
       <w:lvlText w:val=" "/>
       <w:lvlJc w:val="left"/>
       <w:pPr>
-        <w:ind w:left="2160" w:hanging="480"/>
+        <w:ind w:left="2160" w:hanging="360"/>
       </w:pPr>
     </w:lvl>
     <w:lvl w:ilvl="3">
@@ -554,7 +554,7 @@
       <w:lvlText w:val=" "/>
       <w:lvlJc w:val="left"/>
       <w:pPr>
-        <w:ind w:left="2880" w:hanging="480"/>
+        <w:ind w:left="2880" w:hanging="360"/>
       </w:pPr>
     </w:lvl>
     <w:lvl w:ilvl="4">
@@ -562,7 +562,7 @@
       <w:lvlText w:val=" "/>
       <w:lvlJc w:val="left"/>
       <w:pPr>
-        <w:ind w:left="3600" w:hanging="480"/>
+        <w:ind w:left="3600" w:hanging="360"/>
       </w:pPr>
     </w:lvl>
     <w:lvl w:ilvl="5">
@@ -570,7 +570,7 @@
       <w:lvlText w:val=" "/>
       <w:lvlJc w:val="left"/>
       <w:pPr>
-        <w:ind w:left="4320" w:hanging="480"/>
+        <w:ind w:left="4320" w:hanging="360"/>
       </w:pPr>
     </w:lvl>
     <w:lvl w:ilvl="6">
@@ -578,7 +578,7 @@
       <w:lvlText w:val=" "/>
       <w:lvlJc w:val="left"/>
       <w:pPr>
-        <w:ind w:left="5040" w:hanging="480"/>
+        <w:ind w:left="5040" w:hanging="360"/>
       </w:pPr>
     </w:lvl>
     <w:lvl w:ilvl="7">
@@ -586,7 +586,7 @@
       <w:lvlText w:val=" "/>
       <w:lvlJc w:val="left"/>
       <w:pPr>
-        <w:ind w:left="5760" w:hanging="480"/>
+        <w:ind w:left="5760" w:hanging="360"/>
       </w:pPr>
     </w:lvl>
     <w:lvl w:ilvl="8">
@@ -594,7 +594,7 @@
       <w:lvlText w:val=" "/>
       <w:lvlJc w:val="left"/>
       <w:pPr>
-        <w:ind w:left="6480" w:hanging="480"/>
+        <w:ind w:left="6480" w:hanging="360"/>
       </w:pPr>
     </w:lvl>
   </w:abstractNum>
@@ -1317,8 +1317,8 @@
     <w:name w:val="KeywordTok"/>
     <w:basedOn w:val="VerbatimChar"/>
     <w:rPr>
+      <w:b/>
       <w:color w:val="007020"/>
-      <w:b/>
     </w:rPr>
   </w:style>
   <w:style w:type="character" w:customStyle="1" w:styleId="DataTypeTok">
@@ -1395,42 +1395,42 @@
     <w:name w:val="ImportTok"/>
     <w:basedOn w:val="VerbatimChar"/>
     <w:rPr>
+      <w:b/>
       <w:color w:val="008000"/>
-      <w:b/>
     </w:rPr>
   </w:style>
   <w:style w:type="character" w:customStyle="1" w:styleId="CommentTok">
     <w:name w:val="CommentTok"/>
     <w:basedOn w:val="VerbatimChar"/>
     <w:rPr>
+      <w:i/>
       <w:color w:val="60a0b0"/>
-      <w:i/>
     </w:rPr>
   </w:style>
   <w:style w:type="character" w:customStyle="1" w:styleId="DocumentationTok">
     <w:name w:val="DocumentationTok"/>
     <w:basedOn w:val="VerbatimChar"/>
     <w:rPr>
+      <w:i/>
       <w:color w:val="ba2121"/>
-      <w:i/>
     </w:rPr>
   </w:style>
   <w:style w:type="character" w:customStyle="1" w:styleId="AnnotationTok">
     <w:name w:val="AnnotationTok"/>
     <w:basedOn w:val="VerbatimChar"/>
     <w:rPr>
-      <w:color w:val="60a0b0"/>
       <w:b/>
       <w:i/>
+      <w:color w:val="60a0b0"/>
     </w:rPr>
   </w:style>
   <w:style w:type="character" w:customStyle="1" w:styleId="CommentVarTok">
     <w:name w:val="CommentVarTok"/>
     <w:basedOn w:val="VerbatimChar"/>
     <w:rPr>
-      <w:color w:val="60a0b0"/>
       <w:b/>
       <w:i/>
+      <w:color w:val="60a0b0"/>
     </w:rPr>
   </w:style>
   <w:style w:type="character" w:customStyle="1" w:styleId="OtherTok">
@@ -1458,8 +1458,8 @@
     <w:name w:val="ControlFlowTok"/>
     <w:basedOn w:val="VerbatimChar"/>
     <w:rPr>
+      <w:b/>
       <w:color w:val="007020"/>
-      <w:b/>
     </w:rPr>
   </w:style>
   <w:style w:type="character" w:customStyle="1" w:styleId="OperatorTok">
@@ -1504,34 +1504,34 @@
     <w:name w:val="InformationTok"/>
     <w:basedOn w:val="VerbatimChar"/>
     <w:rPr>
-      <w:color w:val="60a0b0"/>
       <w:b/>
       <w:i/>
+      <w:color w:val="60a0b0"/>
     </w:rPr>
   </w:style>
   <w:style w:type="character" w:customStyle="1" w:styleId="WarningTok">
     <w:name w:val="WarningTok"/>
     <w:basedOn w:val="VerbatimChar"/>
     <w:rPr>
-      <w:color w:val="60a0b0"/>
       <w:b/>
       <w:i/>
+      <w:color w:val="60a0b0"/>
     </w:rPr>
   </w:style>
   <w:style w:type="character" w:customStyle="1" w:styleId="AlertTok">
     <w:name w:val="AlertTok"/>
     <w:basedOn w:val="VerbatimChar"/>
     <w:rPr>
+      <w:b/>
       <w:color w:val="ff0000"/>
-      <w:b/>
     </w:rPr>
   </w:style>
   <w:style w:type="character" w:customStyle="1" w:styleId="ErrorTok">
     <w:name w:val="ErrorTok"/>
     <w:basedOn w:val="VerbatimChar"/>
     <w:rPr>
+      <w:b/>
       <w:color w:val="ff0000"/>
-      <w:b/>
     </w:rPr>
   </w:style>
   <w:style w:type="character" w:customStyle="1" w:styleId="NormalTok">

</xml_diff>